<commit_message>
TDK dokumentacio es oauth test
</commit_message>
<xml_diff>
--- a/Docs/Absztrakt.docx
+++ b/Docs/Absztrakt.docx
@@ -6,9 +6,164 @@
       <w:pPr>
         <w:pStyle w:val="Cmsor1"/>
         <w:jc w:val="center"/>
-      </w:pPr>
-      <w:r>
-        <w:t>Absztrakt</w:t>
+        <w:rPr>
+          <w:b/>
+          <w:bCs/>
+          <w:color w:val="000000" w:themeColor="text1"/>
+        </w:rPr>
+      </w:pPr>
+      <w:r>
+        <w:rPr>
+          <w:b/>
+          <w:bCs/>
+          <w:color w:val="000000" w:themeColor="text1"/>
+        </w:rPr>
+        <w:t>Orvosi képek diagnosztikai célű osztályozása konvolúciós neurális hálózatokkal</w:t>
+      </w:r>
+    </w:p>
+    <w:p>
+      <w:pPr>
+        <w:rPr>
+          <w:rFonts w:asciiTheme="majorHAnsi" w:eastAsiaTheme="majorEastAsia" w:hAnsiTheme="majorHAnsi" w:cstheme="majorBidi"/>
+          <w:b/>
+          <w:bCs/>
+          <w:color w:val="000000" w:themeColor="text1"/>
+          <w:sz w:val="40"/>
+          <w:szCs w:val="40"/>
+        </w:rPr>
+      </w:pPr>
+    </w:p>
+    <w:p/>
+    <w:p/>
+    <w:p/>
+    <w:p/>
+    <w:p/>
+    <w:p/>
+    <w:p/>
+    <w:p/>
+    <w:p/>
+    <w:p/>
+    <w:p>
+      <w:pPr>
+        <w:rPr>
+          <w:sz w:val="28"/>
+          <w:szCs w:val="28"/>
+          <w:lang w:val="en-US"/>
+        </w:rPr>
+      </w:pPr>
+      <w:r>
+        <w:rPr>
+          <w:sz w:val="28"/>
+          <w:szCs w:val="28"/>
+        </w:rPr>
+        <w:t>Készítette</w:t>
+      </w:r>
+      <w:r>
+        <w:rPr>
+          <w:sz w:val="28"/>
+          <w:szCs w:val="28"/>
+          <w:lang w:val="en-US"/>
+        </w:rPr>
+        <w:t>: Kaffai Levente, Számítástechnika</w:t>
+      </w:r>
+      <w:r>
+        <w:rPr>
+          <w:sz w:val="28"/>
+          <w:szCs w:val="28"/>
+          <w:lang w:val="en-US"/>
+        </w:rPr>
+        <w:t xml:space="preserve"> szakos</w:t>
+      </w:r>
+      <w:r>
+        <w:rPr>
+          <w:sz w:val="28"/>
+          <w:szCs w:val="28"/>
+          <w:lang w:val="en-US"/>
+        </w:rPr>
+        <w:t xml:space="preserve"> 4. év</w:t>
+      </w:r>
+      <w:r>
+        <w:rPr>
+          <w:sz w:val="28"/>
+          <w:szCs w:val="28"/>
+          <w:lang w:val="en-US"/>
+        </w:rPr>
+        <w:t>es hallgató</w:t>
+      </w:r>
+    </w:p>
+    <w:p>
+      <w:pPr>
+        <w:rPr>
+          <w:sz w:val="28"/>
+          <w:szCs w:val="28"/>
+        </w:rPr>
+      </w:pPr>
+      <w:r>
+        <w:rPr>
+          <w:sz w:val="28"/>
+          <w:szCs w:val="28"/>
+          <w:lang w:val="en-US"/>
+        </w:rPr>
+        <w:t>Témavezető</w:t>
+      </w:r>
+      <w:r>
+        <w:rPr>
+          <w:sz w:val="28"/>
+          <w:szCs w:val="28"/>
+          <w:lang w:val="en-US"/>
+        </w:rPr>
+        <w:t xml:space="preserve">: Dr. </w:t>
+      </w:r>
+      <w:r>
+        <w:rPr>
+          <w:sz w:val="28"/>
+          <w:szCs w:val="28"/>
+          <w:lang w:val="en-US"/>
+        </w:rPr>
+        <w:t xml:space="preserve">habil. </w:t>
+      </w:r>
+      <w:r>
+        <w:rPr>
+          <w:sz w:val="28"/>
+          <w:szCs w:val="28"/>
+          <w:lang w:val="en-US"/>
+        </w:rPr>
+        <w:t>Szil</w:t>
+      </w:r>
+      <w:r>
+        <w:rPr>
+          <w:sz w:val="28"/>
+          <w:szCs w:val="28"/>
+        </w:rPr>
+        <w:t>ágyi László</w:t>
+      </w:r>
+      <w:r>
+        <w:rPr>
+          <w:sz w:val="28"/>
+          <w:szCs w:val="28"/>
+        </w:rPr>
+        <w:t>, egyetemi tanár</w:t>
+      </w:r>
+    </w:p>
+    <w:p>
+      <w:pPr>
+        <w:sectPr>
+          <w:pgSz w:w="11906" w:h="16838"/>
+          <w:pgMar w:top="1440" w:right="1440" w:bottom="1440" w:left="1440" w:header="708" w:footer="708" w:gutter="0"/>
+          <w:cols w:space="708"/>
+          <w:docGrid w:linePitch="360"/>
+        </w:sectPr>
+      </w:pPr>
+    </w:p>
+    <w:p>
+      <w:pPr>
+        <w:pStyle w:val="Cmsor1"/>
+        <w:ind w:firstLine="708"/>
+        <w:jc w:val="center"/>
+      </w:pPr>
+      <w:r>
+        <w:lastRenderedPageBreak/>
+        <w:t>Kivonat</w:t>
       </w:r>
     </w:p>
     <w:p>
@@ -22,19 +177,13 @@
         <w:tab/>
       </w:r>
       <w:r>
-        <w:t>Az orvosi képalkotás területén a konvolúciós neurális hálózatok (</w:t>
-      </w:r>
-      <w:r>
-        <w:t xml:space="preserve">továbbiakban </w:t>
-      </w:r>
-      <w:r>
-        <w:t>CNN</w:t>
-      </w:r>
-      <w:r>
-        <w:t>-ek, mint Convolutional Neural Network</w:t>
-      </w:r>
-      <w:r>
-        <w:t>) alkalmazása forradalmasította a diagnosztikai eljárásokat, különösen a tüdőröntgen-felvételek elemzésében. A CNN-ek képesek automatikusan felismerni és osztályozni a képeken megjelenő mintázatokat, ami jelentősen támogatja az orvosok munkáját a betegségek korai felismerésében és kezelésében.</w:t>
+        <w:t xml:space="preserve">Napjainkban a tüdőgyulladás a leggyakoribb fertőző betegségek egyike, amely világszerte </w:t>
+      </w:r>
+      <w:r>
+        <w:t>jelentős megbetegedést és halálozást okoz</w:t>
+      </w:r>
+      <w:r>
+        <w:t>. A korai és pontos diagnózis kulcsfontosságú a hatékony kezelés megkezdéséhez, azonban a röntgenfelvételek értelmezése időigényes és szubjektív folyamat. Kutatásom célja olyan automatikus osztályozó algoritmus kidolgozása, amely képes a tüdőgyulladás különböző típusainak (vírusos tüdőgyulladás, COVID-19 eredetű tüdőgyulladás) felismerésére és elkülönítésére a normál esetektől és egyéb tüdőelváltozásoktól röntgenfelvételek alapján.</w:t>
       </w:r>
     </w:p>
     <w:p>
@@ -43,28 +192,67 @@
         <w:jc w:val="both"/>
       </w:pPr>
       <w:r>
-        <w:t xml:space="preserve">A </w:t>
-      </w:r>
-      <w:r>
-        <w:t>CNN-ek</w:t>
-      </w:r>
-      <w:r>
-        <w:t xml:space="preserve"> a mélytanulás egy speciális típusát képviselik, amelyeket kifejezetten képfeldolgozási feladatokra terveztek. Ezek a hálózatok képesek a képekben rejlő jellemzők automatikus kinyerésére és elemzésére, ami különösen hasznos az orvosi diagnosztikában, ahol nagy mennyiségű kép gyors és pontos kiértékelésére van szükség. </w:t>
-      </w:r>
-      <w:r>
-        <w:t xml:space="preserve">A </w:t>
-      </w:r>
-      <w:r>
-        <w:t>CNN-ek</w:t>
-      </w:r>
-      <w:r>
-        <w:t xml:space="preserve"> alkalmazása lehetővé te</w:t>
-      </w:r>
-      <w:r>
-        <w:t>heti</w:t>
-      </w:r>
-      <w:r>
-        <w:t xml:space="preserve"> a radiológusok számára, hogy hatékonyabban és pontosabban végezzék munkájukat, csökkentve ezzel a diagnosztikai hibák számát és javítva a betegellátás minőségét.​</w:t>
+        <w:t xml:space="preserve">Az algoritmus megvalósításához </w:t>
+      </w:r>
+      <w:r>
+        <w:t xml:space="preserve">három </w:t>
+      </w:r>
+      <w:r>
+        <w:t>különböző mély konvolúciós neurális hálózat</w:t>
+      </w:r>
+      <w:r>
+        <w:t>i</w:t>
+      </w:r>
+      <w:r>
+        <w:t xml:space="preserve"> architektúrá</w:t>
+      </w:r>
+      <w:r>
+        <w:t>t</w:t>
+      </w:r>
+      <w:r>
+        <w:t xml:space="preserve"> hasonlítottam össze, </w:t>
+      </w:r>
+      <w:r>
+        <w:t>ezek</w:t>
+      </w:r>
+      <w:r>
+        <w:t xml:space="preserve"> a ResNet-50, GoogLeNet és Inception-ResNet-v2 modellek.</w:t>
+      </w:r>
+      <w:r>
+        <w:br/>
+      </w:r>
+      <w:r>
+        <w:t xml:space="preserve">A PyTorch keretrendszerben implementált modellek betanításához </w:t>
+      </w:r>
+      <w:r>
+        <w:t xml:space="preserve">speciális adatelőkészítő modult </w:t>
+      </w:r>
+      <w:r>
+        <w:t>(MaskedImageDataset) fejlesztettem, amely lehetővé tette a röntgenképek és a hozzájuk tartozó szegmentációs maszkok hatékony kezelését</w:t>
+      </w:r>
+      <w:r>
+        <w:t>, annak érdekében, hogy valós és hasznos képi adatokon tudjanak tanulni az általam tanított modellek</w:t>
+      </w:r>
+      <w:r>
+        <w:t>. A modellek kiértékelését 5-szörös keresztvalidációs módszerrel végeztem</w:t>
+      </w:r>
+      <w:r>
+        <w:t xml:space="preserve">. </w:t>
+      </w:r>
+      <w:r>
+        <w:t>A modellek teljesítményének egységes és objektív értékelése érdekében</w:t>
+      </w:r>
+      <w:r>
+        <w:t xml:space="preserve">, </w:t>
+      </w:r>
+      <w:r>
+        <w:t>a modellek teljesen összekapcsolt kimeneti réteg</w:t>
+      </w:r>
+      <w:r>
+        <w:t>e egységesítésre került</w:t>
+      </w:r>
+      <w:r>
+        <w:t>.</w:t>
       </w:r>
     </w:p>
     <w:p>
@@ -73,152 +261,119 @@
         <w:jc w:val="both"/>
       </w:pPr>
       <w:r>
-        <w:t>A CNN-ek alkalmazása számos előnnyel jár az orvosi diagnosztikában</w:t>
-      </w:r>
-      <w:r>
-        <w:t xml:space="preserve">, ilyen lehet az </w:t>
-      </w:r>
-      <w:r>
-        <w:t xml:space="preserve"> automatizált elemzés</w:t>
-      </w:r>
-      <w:r>
-        <w:t>, mivel ezek a hálók</w:t>
-      </w:r>
-      <w:r>
-        <w:t xml:space="preserve"> képesek nagy mennyiségű kép</w:t>
-      </w:r>
-      <w:r>
-        <w:t>anyag</w:t>
-      </w:r>
-      <w:r>
-        <w:t xml:space="preserve"> gyors és pontos elemzésére, ami csökkenti az orvosok terhelését és növeli a diagnosztikai folyamat hatékonyságát.​</w:t>
-      </w:r>
-      <w:r>
-        <w:br/>
-      </w:r>
-      <w:r>
-        <w:t>Ilyen előnyük lehet a</w:t>
-      </w:r>
+        <w:t xml:space="preserve">A legjobb </w:t>
+      </w:r>
+      <w:r>
+        <w:t>eredményt</w:t>
+      </w:r>
+      <w:r>
+        <w:t xml:space="preserve"> az Inception-ResNet-v2 architektúra érte el, átlagosan 93,1%-os </w:t>
+      </w:r>
+      <w:r>
+        <w:t xml:space="preserve">osztályozási </w:t>
+      </w:r>
+      <w:r>
+        <w:t xml:space="preserve">pontossággal. </w:t>
+      </w:r>
+      <w:r>
+        <w:t>A modell mind a négy vizsgált kategóriában (COVID, Normál, Vírusos tüdőgyulladás, Tüdőhomály) kimagasló eredményeket ért el</w:t>
+      </w:r>
+      <w:r>
+        <w:t xml:space="preserve">, 0,9315-ös makró F1-értékkel. A kategóriánkénti teljesítményt tekintve a Vírusos tüdőgyulladás esetében érte el a legmagasabb F1-értéket (0,9524), míg a COVID-19 esetében 0,9276, Normál esetekben 0,9465, Tüdőhomály esetén pedig 0,8996 volt az F1-érték. A </w:t>
+      </w:r>
+      <w:r>
+        <w:t>tanítási folyamat elvégézéséhez</w:t>
+      </w:r>
+      <w:r>
+        <w:t xml:space="preserve"> </w:t>
+      </w:r>
+      <w:r>
+        <w:t xml:space="preserve">és </w:t>
+      </w:r>
+      <w:r>
+        <w:t>a</w:t>
+      </w:r>
+      <w:r>
+        <w:t>z objektív elemzéshez</w:t>
+      </w:r>
+      <w:r>
+        <w:t xml:space="preserve"> COVID-19 Radiography Database publikus adathalmazt használtam, amely több mint 21000 annotált röntgenfelvételt tartalmaz.</w:t>
+      </w:r>
+    </w:p>
+    <w:p>
+      <w:pPr>
+        <w:ind w:firstLine="708"/>
+        <w:jc w:val="both"/>
+      </w:pPr>
+      <w:r>
+        <w:t>Következtetésként, a</w:t>
+      </w:r>
+      <w:r>
+        <w:t xml:space="preserve"> kifejlesztett rendszer jelentősen felgyorsíthatja és objektívebbé teheti a tüdőgyulladás diagnosztikáját, csökkentve az orvosok terhelését és a diagnosztikai hibák előfordulását. A módszer könnyen integrálható meglévő klinikai munkafolyamatokba, valós idejű döntéstámogatást nyújtva a radiológusok számára. A modell további fejlesztése és validálása klinikai környezetben fontos következő lépés a gyakorlati alkalmazhatóság igazolására.</w:t>
+      </w:r>
+    </w:p>
+    <w:p>
+      <w:pPr>
+        <w:jc w:val="both"/>
+        <w:sectPr>
+          <w:pgSz w:w="11906" w:h="16838"/>
+          <w:pgMar w:top="1440" w:right="1440" w:bottom="1440" w:left="1440" w:header="708" w:footer="708" w:gutter="0"/>
+          <w:cols w:space="708"/>
+          <w:docGrid w:linePitch="360"/>
+        </w:sectPr>
+      </w:pPr>
       <w:r>
         <w:rPr>
           <w:b/>
           <w:bCs/>
         </w:rPr>
+        <w:t>Kulcsszavak:</w:t>
+      </w:r>
+      <w:r>
         <w:t xml:space="preserve"> </w:t>
       </w:r>
       <w:r>
-        <w:t>betegségek k</w:t>
-      </w:r>
-      <w:r>
-        <w:t>orai felismerés</w:t>
-      </w:r>
-      <w:r>
-        <w:t xml:space="preserve">e, mert </w:t>
-      </w:r>
-      <w:r>
-        <w:t xml:space="preserve">a konvolúciós neurális hálózatok segítségével a betegségek korai stádiumban felismerhetők, </w:t>
-      </w:r>
-      <w:r>
-        <w:t>ez pedig</w:t>
-      </w:r>
-      <w:r>
-        <w:t xml:space="preserve"> javít</w:t>
-      </w:r>
-      <w:r>
-        <w:t xml:space="preserve">hatja </w:t>
-      </w:r>
-      <w:r>
-        <w:t>a kezelés eredményességét és a betegek túlélési esélyeit</w:t>
-      </w:r>
-      <w:r>
-        <w:t>, valamint nem elengedhetetlen szempontja a</w:t>
-      </w:r>
-      <w:r>
-        <w:t xml:space="preserve"> gépi elemzés</w:t>
-      </w:r>
-      <w:r>
-        <w:t>nek az, hogy</w:t>
-      </w:r>
-      <w:r>
-        <w:t xml:space="preserve"> csökkenti az emberi szubjektivitásból adódó hibákat, így a diagnózisok megbízhatóbbak és reprodukálhatóbb</w:t>
-      </w:r>
-      <w:r>
-        <w:t>á válnak</w:t>
-      </w:r>
-      <w:r>
-        <w:t>.​</w:t>
-      </w:r>
-      <w:r>
-        <w:t xml:space="preserve"> </w:t>
-      </w:r>
-      <w:r>
-        <w:t>Ugyanakkor kihívások is felmerülnek</w:t>
-      </w:r>
-      <w:r>
-        <w:t xml:space="preserve">, mint az </w:t>
-      </w:r>
-      <w:r>
-        <w:t>a</w:t>
-      </w:r>
-      <w:r>
-        <w:t>datminőség</w:t>
-      </w:r>
-      <w:r>
-        <w:t xml:space="preserve">. </w:t>
-      </w:r>
-      <w:r>
-        <w:t>A CNN-ek teljesítménye nagymértékben függ az adat</w:t>
-      </w:r>
-      <w:r>
-        <w:t>halmazok</w:t>
-      </w:r>
-      <w:r>
-        <w:t xml:space="preserve"> minőségétől és méretétől. A rossz minőségű vagy nem reprezentatív adatok pontatlan eredményekhez vezethetnek.​</w:t>
-      </w:r>
-      <w:r>
-        <w:t xml:space="preserve"> </w:t>
-      </w:r>
-      <w:r>
-        <w:t>Átláthat</w:t>
-      </w:r>
-      <w:r>
-        <w:t>atlan</w:t>
-      </w:r>
-      <w:r>
-        <w:t>ság</w:t>
-      </w:r>
-      <w:r>
-        <w:t>uk miatt</w:t>
-      </w:r>
-      <w:r>
-        <w:t xml:space="preserve"> </w:t>
-      </w:r>
-      <w:r>
-        <w:t>a</w:t>
-      </w:r>
-      <w:r>
-        <w:t xml:space="preserve"> mélytanulási modellek gyakran "fekete dobozként" működnek, ami megnehezíti a döntési folyamatok megértését és magyarázatát</w:t>
-      </w:r>
-      <w:r>
-        <w:t xml:space="preserve">, illetve </w:t>
-      </w:r>
-      <w:r>
-        <w:t>e</w:t>
-      </w:r>
-      <w:r>
-        <w:t>tikai kérdések</w:t>
-      </w:r>
-      <w:r>
-        <w:t xml:space="preserve"> is felmerülhetnek, mert</w:t>
-      </w:r>
-      <w:r>
-        <w:t xml:space="preserve"> </w:t>
-      </w:r>
-      <w:r>
-        <w:t>a</w:t>
-      </w:r>
-      <w:r>
-        <w:t>z automatizált diagnosztikai rendszerek alkalmazása felveti a felelősség és az adatvédelem kérdéseit, amelyeket megfelelően kell kezelni.​</w:t>
+        <w:t>orvosi képalkotás, diagnosztika, gépi tanulás, konvolúciós neurális hálózatok, tüdőgyulladás, röntgenképek osztályozása</w:t>
+      </w:r>
+    </w:p>
+    <w:p>
+      <w:pPr>
+        <w:pStyle w:val="Cmsor2"/>
+        <w:numPr>
+          <w:ilvl w:val="0"/>
+          <w:numId w:val="3"/>
+        </w:numPr>
+        <w:tabs>
+          <w:tab w:val="num" w:pos="720"/>
+        </w:tabs>
+        <w:ind w:left="720"/>
+      </w:pPr>
+      <w:r>
+        <w:lastRenderedPageBreak/>
+        <w:t>Bevezető</w:t>
+      </w:r>
+    </w:p>
+    <w:p>
+      <w:pPr>
+        <w:jc w:val="both"/>
+      </w:pPr>
+      <w:r>
+        <w:tab/>
+      </w:r>
+      <w:r>
+        <w:t>Az orvosi képalkotás területén a konvolúciós neurális hálózatok (</w:t>
+      </w:r>
+      <w:r>
+        <w:t xml:space="preserve">továbbiakban </w:t>
+      </w:r>
+      <w:r>
+        <w:t>CNN</w:t>
+      </w:r>
+      <w:r>
+        <w:t>-ek, mint Convolutional Neural Network</w:t>
+      </w:r>
+      <w:r>
+        <w:t>) alkalmazása forradalmasította a diagnosztikai eljárásokat, különösen a tüdőröntgen-felvételek elemzésében. A CNN-ek képesek automatikusan felismerni és osztályozni a képeken megjelenő mintázatokat, ami jelentősen támogatja az orvosok munkáját a betegségek korai felismerésében és kezelésében.</w:t>
       </w:r>
     </w:p>
     <w:p>
@@ -227,43 +382,25 @@
         <w:jc w:val="both"/>
       </w:pPr>
       <w:r>
-        <w:t xml:space="preserve">A tüdőröntgen-felvételek elemzése során a </w:t>
+        <w:t xml:space="preserve">A </w:t>
       </w:r>
       <w:r>
         <w:t>CNN-ek</w:t>
       </w:r>
       <w:r>
-        <w:t xml:space="preserve"> képesek különbséget tenni a normál és a kóros állapotok között, mint például a COVID-19, a vírusos tüdőgyulladás és más nem COVID-19 eredetű tüdőfertőzések. Ez különösen fontos </w:t>
-      </w:r>
-      <w:r>
-        <w:t>lehet egy olyan</w:t>
-      </w:r>
-      <w:r>
-        <w:t xml:space="preserve"> pandémiás helyzetben</w:t>
-      </w:r>
-      <w:r>
-        <w:t>, mint amit az elmúlt években tapasztaltunk</w:t>
-      </w:r>
-      <w:r>
-        <w:t>,</w:t>
-      </w:r>
-      <w:r>
-        <w:t xml:space="preserve"> vagy akár a mindennapok fertőző osztályain,</w:t>
-      </w:r>
-      <w:r>
-        <w:t xml:space="preserve"> ahol a gyors és pontos diagnózis életeket menthet.​</w:t>
-      </w:r>
-      <w:r>
-        <w:t xml:space="preserve"> </w:t>
-      </w:r>
-      <w:r>
-        <w:t>A CNN-ek hatékony működéséhez nagy mennyiségű, jól annotált kép szükséges. Az egyik ilyen forrás a COVID-19 Radiography Database, amely COVID-19 pozitív esetek mellett normál és vírusos tüdőgyulladásos képeket is tartalmaz. Ez az adatbázis</w:t>
-      </w:r>
-      <w:r>
-        <w:t xml:space="preserve"> lehetőséget biztosít</w:t>
-      </w:r>
-      <w:r>
-        <w:t xml:space="preserve"> a CNN-ek számára, hogy megtanulják felismerni a különböző tüdőfertőzések jellegzetességeit, ami elengedhetetlen a pontos osztályozáshoz.​</w:t>
+        <w:t xml:space="preserve"> a mélytanulás egy speciális típusát képviselik, amelyeket kifejezetten képfeldolgozási feladatokra terveztek. Ezek a hálózatok képesek a képekben rejlő jellemzők automatikus kinyerésére és elemzésére, ami különösen hasznos az orvosi diagnosztikában, ahol nagy mennyiségű kép gyors és pontos kiértékelésére van szükség. </w:t>
+      </w:r>
+      <w:r>
+        <w:t>A CNN-ek</w:t>
+      </w:r>
+      <w:r>
+        <w:t xml:space="preserve"> alkalmazása lehetővé te</w:t>
+      </w:r>
+      <w:r>
+        <w:t>heti</w:t>
+      </w:r>
+      <w:r>
+        <w:t xml:space="preserve"> a radiológusok számára, hogy hatékonyabban és pontosabban végezzék munkájukat, csökkentve ezzel a diagnosztikai hibák számát és javítva a betegellátás minőségét.</w:t>
       </w:r>
     </w:p>
     <w:p>
@@ -272,6 +409,205 @@
         <w:jc w:val="both"/>
       </w:pPr>
       <w:r>
+        <w:t>A CNN-ek alkalmazása számos előnnyel jár az orvosi diagnosztikában</w:t>
+      </w:r>
+      <w:r>
+        <w:t xml:space="preserve">, ilyen lehet az </w:t>
+      </w:r>
+      <w:r>
+        <w:t xml:space="preserve"> automatizált elemzés</w:t>
+      </w:r>
+      <w:r>
+        <w:t>, mivel ezek a hálók</w:t>
+      </w:r>
+      <w:r>
+        <w:t xml:space="preserve"> képesek nagy mennyiségű kép</w:t>
+      </w:r>
+      <w:r>
+        <w:t>anyag</w:t>
+      </w:r>
+      <w:r>
+        <w:t xml:space="preserve"> gyors és pontos elemzésére, ami csökkenti az orvosok terhelését és növeli a diagnosztikai folyamat hatékonyságát.</w:t>
+      </w:r>
+      <w:r>
+        <w:br/>
+      </w:r>
+      <w:r>
+        <w:t>Ilyen előnyük lehet a</w:t>
+      </w:r>
+      <w:r>
+        <w:rPr>
+          <w:b/>
+          <w:bCs/>
+        </w:rPr>
+        <w:t xml:space="preserve"> </w:t>
+      </w:r>
+      <w:r>
+        <w:t>betegségek k</w:t>
+      </w:r>
+      <w:r>
+        <w:t>orai felismerés</w:t>
+      </w:r>
+      <w:r>
+        <w:t xml:space="preserve">e, mert </w:t>
+      </w:r>
+      <w:r>
+        <w:t xml:space="preserve">a konvolúciós neurális hálózatok segítségével a betegségek korai stádiumban felismerhetők, </w:t>
+      </w:r>
+      <w:r>
+        <w:t>ez pedig</w:t>
+      </w:r>
+      <w:r>
+        <w:t xml:space="preserve"> javít</w:t>
+      </w:r>
+      <w:r>
+        <w:t xml:space="preserve">hatja </w:t>
+      </w:r>
+      <w:r>
+        <w:t>a kezelés eredményességét és a betegek túlélési esélyeit</w:t>
+      </w:r>
+      <w:r>
+        <w:t>, valamint nem elengedhetetlen szempontja a</w:t>
+      </w:r>
+      <w:r>
+        <w:t xml:space="preserve"> gépi elemzés</w:t>
+      </w:r>
+      <w:r>
+        <w:t>nek az, hogy</w:t>
+      </w:r>
+      <w:r>
+        <w:t xml:space="preserve"> csökkenti az emberi szubjektivitásból adódó hibákat, így a diagnózisok megbízhatóbbak és reprodukálhatóbb</w:t>
+      </w:r>
+      <w:r>
+        <w:t>á válnak</w:t>
+      </w:r>
+      <w:r>
+        <w:t>.</w:t>
+      </w:r>
+      <w:r>
+        <w:t xml:space="preserve"> </w:t>
+      </w:r>
+      <w:r>
+        <w:t>Ugyanakkor kihívások is felmerülnek</w:t>
+      </w:r>
+      <w:r>
+        <w:t xml:space="preserve">, mint az </w:t>
+      </w:r>
+      <w:r>
+        <w:t>a</w:t>
+      </w:r>
+      <w:r>
+        <w:t>datminőség</w:t>
+      </w:r>
+      <w:r>
+        <w:t xml:space="preserve">. </w:t>
+      </w:r>
+      <w:r>
+        <w:t>A CNN-ek teljesítménye nagymértékben függ az adat</w:t>
+      </w:r>
+      <w:r>
+        <w:t>halmazok</w:t>
+      </w:r>
+      <w:r>
+        <w:t xml:space="preserve"> minőségétől és méretétől. A rossz minőségű vagy nem reprezentatív adatok pontatlan eredményekhez vezethetnek.</w:t>
+      </w:r>
+      <w:r>
+        <w:t xml:space="preserve"> </w:t>
+      </w:r>
+      <w:r>
+        <w:t>Átláthat</w:t>
+      </w:r>
+      <w:r>
+        <w:t>atlan</w:t>
+      </w:r>
+      <w:r>
+        <w:t>ság</w:t>
+      </w:r>
+      <w:r>
+        <w:t>uk miatt</w:t>
+      </w:r>
+      <w:r>
+        <w:t xml:space="preserve"> </w:t>
+      </w:r>
+      <w:r>
+        <w:t>a</w:t>
+      </w:r>
+      <w:r>
+        <w:t xml:space="preserve"> mélytanulási modellek gyakran "fekete dobozként" működnek, ami megnehezíti a döntési folyamatok megértését és magyarázatát</w:t>
+      </w:r>
+      <w:r>
+        <w:t xml:space="preserve">, illetve </w:t>
+      </w:r>
+      <w:r>
+        <w:t>e</w:t>
+      </w:r>
+      <w:r>
+        <w:t>tikai kérdések</w:t>
+      </w:r>
+      <w:r>
+        <w:t xml:space="preserve"> is felmerülhetnek, mert</w:t>
+      </w:r>
+      <w:r>
+        <w:t xml:space="preserve"> </w:t>
+      </w:r>
+      <w:r>
+        <w:t>a</w:t>
+      </w:r>
+      <w:r>
+        <w:t>z automatizált diagnosztikai rendszerek alkalmazása felveti a felelősség és az adatvédelem kérdéseit, amelyeket megfelelően kell kezelni.</w:t>
+      </w:r>
+    </w:p>
+    <w:p>
+      <w:pPr>
+        <w:ind w:firstLine="708"/>
+        <w:jc w:val="both"/>
+      </w:pPr>
+      <w:r>
+        <w:t xml:space="preserve">A tüdőröntgen-felvételek elemzése során a </w:t>
+      </w:r>
+      <w:r>
+        <w:t>CNN-ek</w:t>
+      </w:r>
+      <w:r>
+        <w:t xml:space="preserve"> képesek különbséget tenni a normál és a kóros állapotok között, mint például a COVID-19, a vírusos tüdőgyulladás és más nem COVID-19 eredetű tüdőfertőzések. Ez különösen fontos </w:t>
+      </w:r>
+      <w:r>
+        <w:t>lehet egy olyan</w:t>
+      </w:r>
+      <w:r>
+        <w:t xml:space="preserve"> pandémiás helyzetben</w:t>
+      </w:r>
+      <w:r>
+        <w:t>, mint amit az elmúlt években tapasztaltunk</w:t>
+      </w:r>
+      <w:r>
+        <w:t>,</w:t>
+      </w:r>
+      <w:r>
+        <w:t xml:space="preserve"> vagy akár a mindennapok fertőző osztályain,</w:t>
+      </w:r>
+      <w:r>
+        <w:t xml:space="preserve"> ahol a gyors és pontos diagnózis életeket menthet.</w:t>
+      </w:r>
+      <w:r>
+        <w:t xml:space="preserve"> </w:t>
+      </w:r>
+      <w:r>
+        <w:t>A CNN-ek hatékony működéséhez nagy mennyiségű, jól annotált kép szükséges. Az egyik ilyen forrás a COVID-19 Radiography Database, amely COVID-19 pozitív esetek mellett normál és vírusos tüdőgyulladásos képeket is tartalmaz. Ez az adatbázis</w:t>
+      </w:r>
+      <w:r>
+        <w:t xml:space="preserve"> lehetőséget biztosít</w:t>
+      </w:r>
+      <w:r>
+        <w:t xml:space="preserve"> a CNN-ek számára, hogy megtanulják felismerni a különböző tüdőfertőzések jellegzetességeit, ami elengedhetetlen a pontos osztályozáshoz.</w:t>
+      </w:r>
+    </w:p>
+    <w:p>
+      <w:pPr>
+        <w:ind w:firstLine="708"/>
+        <w:jc w:val="both"/>
+      </w:pPr>
+      <w:r>
         <w:t>Következtetés</w:t>
       </w:r>
       <w:r>
@@ -281,7 +617,2254 @@
         <w:t xml:space="preserve"> konvolúciós neurális hálózatok alkalmazása az orvosi képalkotásban, különösen a tüdőröntgen-felvételek osztályozásában, jelentős előrelépést jelent a diagnosztikai eljárásokban. Ezek a rendszerek képesek támogatni az orvosok munkáját, javítva a diagnózisok pontosságát és a betegellátás minőségét. Ugyanakkor fontos figyelembe venni a felmerülő kihívásokat és folyamatosan fejleszteni a technológiát annak érdekében, hogy a lehető legjobb eredményeket érjük el az orvosi gyakorlatban.</w:t>
       </w:r>
     </w:p>
+    <w:p>
+      <w:pPr>
+        <w:rPr>
+          <w:lang w:val="en-US"/>
+        </w:rPr>
+      </w:pPr>
+      <w:r>
+        <w:br w:type="page"/>
+      </w:r>
+    </w:p>
     <w:p/>
+    <w:p>
+      <w:pPr>
+        <w:pStyle w:val="Cmsor2"/>
+        <w:numPr>
+          <w:ilvl w:val="0"/>
+          <w:numId w:val="3"/>
+        </w:numPr>
+        <w:tabs>
+          <w:tab w:val="num" w:pos="720"/>
+        </w:tabs>
+        <w:ind w:left="720"/>
+      </w:pPr>
+      <w:r>
+        <w:t>Dolgozat</w:t>
+      </w:r>
+      <w:r>
+        <w:t xml:space="preserve"> célja</w:t>
+      </w:r>
+    </w:p>
+    <w:p>
+      <w:pPr>
+        <w:ind w:firstLine="360"/>
+        <w:jc w:val="both"/>
+      </w:pPr>
+      <w:r>
+        <w:t xml:space="preserve">A dolgozat </w:t>
+      </w:r>
+      <w:r>
+        <w:t>célja</w:t>
+      </w:r>
+      <w:r>
+        <w:t xml:space="preserve"> </w:t>
+      </w:r>
+      <w:r>
+        <w:t>első sorban elemezni</w:t>
+      </w:r>
+      <w:r>
+        <w:t xml:space="preserve"> a mély tanulású neurális hálózatok elméletét, különös tekintettel a konvolúciós neurális hálózatokra (CNN-ek), amelyek kiemelkedően hatékonyak az orvosi képelemzés területén. Ez magában foglalja a mély tanulási modellek működésének alapelveit, példaprogramok elemzését, valamint a releváns algoritmusok és architektúrák megértését, mint például a ResNet, GoogLeNet és Inception-ResNet-v2 modellek.</w:t>
+      </w:r>
+    </w:p>
+    <w:p>
+      <w:pPr>
+        <w:ind w:firstLine="360"/>
+        <w:jc w:val="both"/>
+        <w:rPr>
+          <w:b/>
+          <w:bCs/>
+        </w:rPr>
+      </w:pPr>
+      <w:r>
+        <w:t>Ezt követő</w:t>
+      </w:r>
+      <w:r>
+        <w:t xml:space="preserve"> cél</w:t>
+      </w:r>
+      <w:r>
+        <w:t xml:space="preserve"> egy vagy több mély tanulású neurális hálózat</w:t>
+      </w:r>
+      <w:r>
+        <w:t xml:space="preserve"> implementálása</w:t>
+      </w:r>
+      <w:r>
+        <w:t xml:space="preserve">, amelyek képesek </w:t>
+      </w:r>
+      <w:r>
+        <w:t xml:space="preserve">valamilyen </w:t>
+      </w:r>
+      <w:r>
+        <w:t>orvosi képek osztályozására. Az algoritmusok célja annak eldöntése, hogy van-e látható elváltozás az adott képen, illetve milyen típusú az elváltozás</w:t>
+      </w:r>
+      <w:r>
+        <w:t xml:space="preserve">. </w:t>
+      </w:r>
+      <w:r>
+        <w:t xml:space="preserve">Az implementáció során modern mély tanulási keretrendszereket kell alkalmazni, amelyek lehetővé teszik hatékony modellek fejlesztését és </w:t>
+      </w:r>
+      <w:r>
+        <w:t xml:space="preserve">a </w:t>
+      </w:r>
+      <w:r>
+        <w:t>GPU-alapú gyorsítást.</w:t>
+      </w:r>
+      <w:r>
+        <w:t xml:space="preserve"> </w:t>
+      </w:r>
+    </w:p>
+    <w:p>
+      <w:pPr>
+        <w:ind w:firstLine="360"/>
+        <w:jc w:val="both"/>
+      </w:pPr>
+      <w:r>
+        <w:t>A kidolgozott módszerek objektív numerikus kiértékelésére is hangsúlyt kell fektetni. Ehhez különböző teljesítménymérési metrikákat kell alkalmazni, mint például pontosság (accuracy), precízió (precision), visszahívási arány (recall), F1-score. A kiértékelést keresztvalidációs technikákkal kell elvégezni annak érdekében, hogy biztosítsuk a modellek általánosíthatóságát és megbízhatóságát.</w:t>
+      </w:r>
+    </w:p>
+    <w:p>
+      <w:pPr>
+        <w:ind w:firstLine="708"/>
+        <w:jc w:val="both"/>
+      </w:pPr>
+      <w:r>
+        <w:t>Az orvosi képek feldolgozásához szükséges adathalmazokat a Kaggle platformról</w:t>
+      </w:r>
+      <w:r>
+        <w:t xml:space="preserve"> is lehet</w:t>
+      </w:r>
+      <w:r>
+        <w:t xml:space="preserve"> gyűjteni. A Kaggle számos jó minőségű orvosi képanyagot kínál, például röntgenfelvételeket (tüdőgyulladás diagnosztizálására), MRI-képeket (tumorok elemzésére) vagy CT-felvételeket (belső sérülések detektálására).</w:t>
+      </w:r>
+      <w:r>
+        <w:t xml:space="preserve"> Személyesen a tüdőgyulladásos megbetegedések osztályozását választottam mellkasi röntgenfelvételek alapján, mivel találtam egy megfelelő és jó minőségű adathalmazt erre a célra a Kaggle oldalán, aminek a neve „</w:t>
+      </w:r>
+      <w:r>
+        <w:t>COVID</w:t>
+      </w:r>
+      <w:r>
+        <w:t>-</w:t>
+      </w:r>
+      <w:r>
+        <w:t>19 Radiography Database</w:t>
+      </w:r>
+      <w:r>
+        <w:t>”.</w:t>
+      </w:r>
+      <w:r>
+        <w:t xml:space="preserve"> </w:t>
+      </w:r>
+      <w:r>
+        <w:t xml:space="preserve">Az adatok előkészítése során fontos a képek </w:t>
+      </w:r>
+      <w:r>
+        <w:t xml:space="preserve">címkéjének </w:t>
+      </w:r>
+      <w:r>
+        <w:t>és szegmentációs maszkjainak integrálása.</w:t>
+      </w:r>
+    </w:p>
+    <w:p>
+      <w:pPr>
+        <w:ind w:firstLine="360"/>
+        <w:jc w:val="both"/>
+      </w:pPr>
+      <w:r>
+        <w:t>Összességében a</w:t>
+      </w:r>
+      <w:r>
+        <w:t xml:space="preserve"> dolgozat célja egy olyan rendszer létrehozása, amely nemcsak pontos diagnosztikai eredményeket nyújt, hanem valós időben is alkalmazható klinikai környezetben.</w:t>
+      </w:r>
+    </w:p>
+    <w:p>
+      <w:pPr>
+        <w:pStyle w:val="Cmsor2"/>
+        <w:numPr>
+          <w:ilvl w:val="0"/>
+          <w:numId w:val="3"/>
+        </w:numPr>
+      </w:pPr>
+      <w:r>
+        <w:t>Követelmény specifikációk</w:t>
+      </w:r>
+    </w:p>
+    <w:p>
+      <w:pPr>
+        <w:pStyle w:val="Cmsor2"/>
+        <w:numPr>
+          <w:ilvl w:val="0"/>
+          <w:numId w:val="3"/>
+        </w:numPr>
+      </w:pPr>
+      <w:r>
+        <w:t>Felhasználói követelmények.</w:t>
+      </w:r>
+    </w:p>
+    <w:p>
+      <w:pPr>
+        <w:pStyle w:val="Cmsor2"/>
+        <w:numPr>
+          <w:ilvl w:val="0"/>
+          <w:numId w:val="3"/>
+        </w:numPr>
+      </w:pPr>
+      <w:r>
+        <w:t>Rendszerkövetelmények</w:t>
+      </w:r>
+    </w:p>
+    <w:p>
+      <w:pPr>
+        <w:pStyle w:val="Cmsor2"/>
+        <w:numPr>
+          <w:ilvl w:val="1"/>
+          <w:numId w:val="3"/>
+        </w:numPr>
+      </w:pPr>
+      <w:r>
+        <w:t>Funkcionális</w:t>
+      </w:r>
+    </w:p>
+    <w:p>
+      <w:pPr>
+        <w:pStyle w:val="Cmsor2"/>
+        <w:numPr>
+          <w:ilvl w:val="1"/>
+          <w:numId w:val="3"/>
+        </w:numPr>
+      </w:pPr>
+      <w:r>
+        <w:t>Nem-funkcionális</w:t>
+      </w:r>
+    </w:p>
+    <w:p>
+      <w:pPr>
+        <w:pStyle w:val="Cmsor2"/>
+        <w:numPr>
+          <w:ilvl w:val="0"/>
+          <w:numId w:val="3"/>
+        </w:numPr>
+      </w:pPr>
+      <w:r>
+        <w:t>Megvalósítás</w:t>
+      </w:r>
+    </w:p>
+    <w:p>
+      <w:pPr>
+        <w:pStyle w:val="Cmsor2"/>
+        <w:numPr>
+          <w:ilvl w:val="1"/>
+          <w:numId w:val="3"/>
+        </w:numPr>
+      </w:pPr>
+      <w:r>
+        <w:t>Adathalmaz elemzése</w:t>
+      </w:r>
+    </w:p>
+    <w:p>
+      <w:pPr>
+        <w:ind w:firstLine="360"/>
+        <w:jc w:val="both"/>
+      </w:pPr>
+      <w:r>
+        <w:t>A tervezés során első lépésként megfelelő adathalmazt kellett választanom, ami megfelelő mennyiségű adattal rendelkezik annak érdekében, hogy eredményként viszonylag magas pontossággú osztályozót tudjak létrehozni. Az adathalmaz helyességét és minőségét hisztogramm</w:t>
+      </w:r>
+      <w:r>
+        <w:t xml:space="preserve"> készítéssel</w:t>
+      </w:r>
+      <w:r>
+        <w:t xml:space="preserve"> és klaszterezési módszerekkel</w:t>
+      </w:r>
+      <w:r>
+        <w:t xml:space="preserve"> ellenőríztem</w:t>
+      </w:r>
+      <w:r>
+        <w:t>.</w:t>
+      </w:r>
+    </w:p>
+    <w:p>
+      <w:pPr>
+        <w:ind w:firstLine="360"/>
+        <w:jc w:val="both"/>
+      </w:pPr>
+      <w:r>
+        <w:rPr>
+          <w:noProof/>
+        </w:rPr>
+        <w:lastRenderedPageBreak/>
+        <w:drawing>
+          <wp:inline distT="0" distB="0" distL="0" distR="0" wp14:anchorId="06DE2707" wp14:editId="2DEC5DCF">
+            <wp:extent cx="5109351" cy="3733800"/>
+            <wp:effectExtent l="0" t="0" r="0" b="0"/>
+            <wp:docPr id="598501742" name="Kép 5"/>
+            <wp:cNvGraphicFramePr>
+              <a:graphicFrameLocks xmlns:a="http://schemas.openxmlformats.org/drawingml/2006/main" noChangeAspect="1"/>
+            </wp:cNvGraphicFramePr>
+            <a:graphic xmlns:a="http://schemas.openxmlformats.org/drawingml/2006/main">
+              <a:graphicData uri="http://schemas.openxmlformats.org/drawingml/2006/picture">
+                <pic:pic xmlns:pic="http://schemas.openxmlformats.org/drawingml/2006/picture">
+                  <pic:nvPicPr>
+                    <pic:cNvPr id="0" name="Picture 22"/>
+                    <pic:cNvPicPr>
+                      <a:picLocks noChangeAspect="1" noChangeArrowheads="1"/>
+                    </pic:cNvPicPr>
+                  </pic:nvPicPr>
+                  <pic:blipFill>
+                    <a:blip r:embed="rId5">
+                      <a:extLst>
+                        <a:ext uri="{28A0092B-C50C-407E-A947-70E740481C1C}">
+                          <a14:useLocalDpi xmlns:a14="http://schemas.microsoft.com/office/drawing/2010/main" val="0"/>
+                        </a:ext>
+                      </a:extLst>
+                    </a:blip>
+                    <a:srcRect/>
+                    <a:stretch>
+                      <a:fillRect/>
+                    </a:stretch>
+                  </pic:blipFill>
+                  <pic:spPr bwMode="auto">
+                    <a:xfrm>
+                      <a:off x="0" y="0"/>
+                      <a:ext cx="5119567" cy="3741266"/>
+                    </a:xfrm>
+                    <a:prstGeom prst="rect">
+                      <a:avLst/>
+                    </a:prstGeom>
+                    <a:noFill/>
+                    <a:ln>
+                      <a:noFill/>
+                    </a:ln>
+                  </pic:spPr>
+                </pic:pic>
+              </a:graphicData>
+            </a:graphic>
+          </wp:inline>
+        </w:drawing>
+      </w:r>
+    </w:p>
+    <w:p>
+      <w:pPr>
+        <w:ind w:firstLine="360"/>
+        <w:jc w:val="both"/>
+        <w:rPr>
+          <w:lang w:val="en-US"/>
+        </w:rPr>
+      </w:pPr>
+      <w:r>
+        <w:t>Ahogy a fenti hisztogram is szemlélteti, az osztályok eloszlása a következő</w:t>
+      </w:r>
+      <w:r>
+        <w:rPr>
+          <w:lang w:val="en-US"/>
+        </w:rPr>
+        <w:t>:</w:t>
+      </w:r>
+    </w:p>
+    <w:p>
+      <w:pPr>
+        <w:pStyle w:val="Listaszerbekezds"/>
+        <w:numPr>
+          <w:ilvl w:val="0"/>
+          <w:numId w:val="14"/>
+        </w:numPr>
+      </w:pPr>
+      <w:r>
+        <w:t>COVID: 3616</w:t>
+      </w:r>
+    </w:p>
+    <w:p>
+      <w:pPr>
+        <w:pStyle w:val="Listaszerbekezds"/>
+        <w:numPr>
+          <w:ilvl w:val="0"/>
+          <w:numId w:val="14"/>
+        </w:numPr>
+      </w:pPr>
+      <w:r>
+        <w:t>Lung_Opacity: 6012</w:t>
+      </w:r>
+    </w:p>
+    <w:p>
+      <w:pPr>
+        <w:pStyle w:val="Listaszerbekezds"/>
+        <w:numPr>
+          <w:ilvl w:val="0"/>
+          <w:numId w:val="14"/>
+        </w:numPr>
+      </w:pPr>
+      <w:r>
+        <w:t>Normal: 10192</w:t>
+      </w:r>
+    </w:p>
+    <w:p>
+      <w:pPr>
+        <w:pStyle w:val="Listaszerbekezds"/>
+        <w:numPr>
+          <w:ilvl w:val="0"/>
+          <w:numId w:val="14"/>
+        </w:numPr>
+      </w:pPr>
+      <w:r>
+        <w:t>Viral Pneumonia: 1345</w:t>
+      </w:r>
+    </w:p>
+    <w:p>
+      <w:pPr>
+        <w:jc w:val="both"/>
+      </w:pPr>
+      <w:r>
+        <w:t xml:space="preserve">Abból az okból származóan, hogy az adatok eloszlása nem egyforma, hasznosnak véltem a klaszterek </w:t>
+      </w:r>
+      <w:r>
+        <w:t>vizualizálását az adathalmazban, annak érdekében, hogy látható legyen az indokoltsága bizonyos kategóriáknak a magasabb elemszám, mint egyeseknek.</w:t>
+      </w:r>
+      <w:r>
+        <w:t xml:space="preserve"> </w:t>
+      </w:r>
+    </w:p>
+    <w:p>
+      <w:pPr>
+        <w:ind w:firstLine="360"/>
+        <w:jc w:val="both"/>
+        <w:rPr>
+          <w:noProof/>
+        </w:rPr>
+      </w:pPr>
+      <w:r>
+        <w:t>.</w:t>
+      </w:r>
+      <w:r>
+        <w:t xml:space="preserve"> </w:t>
+      </w:r>
+      <w:r>
+        <w:rPr>
+          <w:noProof/>
+        </w:rPr>
+        <w:t>.</w:t>
+      </w:r>
+      <w:r>
+        <w:rPr>
+          <w:noProof/>
+        </w:rPr>
+        <w:t xml:space="preserve"> </w:t>
+      </w:r>
+      <w:r>
+        <w:rPr>
+          <w:noProof/>
+        </w:rPr>
+        <w:t>A klaszterezést PCA (</w:t>
+      </w:r>
+      <w:r>
+        <w:rPr>
+          <w:noProof/>
+        </w:rPr>
+        <w:t xml:space="preserve">Principal </w:t>
+      </w:r>
+      <w:r>
+        <w:rPr>
+          <w:noProof/>
+        </w:rPr>
+        <w:t>C</w:t>
+      </w:r>
+      <w:r>
+        <w:rPr>
+          <w:noProof/>
+        </w:rPr>
+        <w:t xml:space="preserve">omponent </w:t>
+      </w:r>
+      <w:r>
+        <w:rPr>
+          <w:noProof/>
+        </w:rPr>
+        <w:t>A</w:t>
+      </w:r>
+      <w:r>
+        <w:rPr>
+          <w:noProof/>
+        </w:rPr>
+        <w:t>nalysis</w:t>
+      </w:r>
+      <w:r>
+        <w:rPr>
+          <w:noProof/>
+        </w:rPr>
+        <w:t>) és T-SNE (</w:t>
+      </w:r>
+      <w:r>
+        <w:rPr>
+          <w:noProof/>
+        </w:rPr>
+        <w:t>T-distributed Stochastic Neighbor Embedding</w:t>
+      </w:r>
+      <w:r>
+        <w:rPr>
+          <w:noProof/>
+        </w:rPr>
+        <w:t xml:space="preserve">) </w:t>
+      </w:r>
+      <w:r>
+        <w:rPr>
+          <w:noProof/>
+        </w:rPr>
+        <w:t>dimenziócsökkentési</w:t>
+      </w:r>
+      <w:r>
+        <w:rPr>
+          <w:noProof/>
+        </w:rPr>
+        <w:t xml:space="preserve"> módszerekkel végeztem, mindkettő a scikit-learn Python könyvtárában levő metódusok</w:t>
+      </w:r>
+      <w:r>
+        <w:rPr>
+          <w:noProof/>
+        </w:rPr>
+        <w:t>.</w:t>
+      </w:r>
+      <w:r>
+        <w:rPr>
+          <w:noProof/>
+        </w:rPr>
+        <w:t xml:space="preserve"> </w:t>
+      </w:r>
+      <w:r>
+        <w:rPr>
+          <w:noProof/>
+        </w:rPr>
+        <w:t xml:space="preserve">A PCA gyors és értelmezhető megoldást kínál lineáris dimenziócsökkentésre, míg a t-SNE </w:t>
+      </w:r>
+      <w:r>
+        <w:rPr>
+          <w:noProof/>
+        </w:rPr>
+        <w:t>jobb</w:t>
+      </w:r>
+      <w:r>
+        <w:rPr>
+          <w:noProof/>
+        </w:rPr>
+        <w:t xml:space="preserve"> eszköz komplex mintázatok vizualizációjára. </w:t>
+      </w:r>
+      <w:r>
+        <w:rPr>
+          <w:noProof/>
+        </w:rPr>
+        <w:t>Egyik</w:t>
+      </w:r>
+      <w:r>
+        <w:rPr>
+          <w:noProof/>
+        </w:rPr>
+        <w:t xml:space="preserve"> az adatok globális</w:t>
+      </w:r>
+      <w:r>
+        <w:rPr>
+          <w:noProof/>
+        </w:rPr>
+        <w:t xml:space="preserve">, a másik a </w:t>
+      </w:r>
+      <w:r>
+        <w:rPr>
+          <w:noProof/>
+        </w:rPr>
+        <w:t xml:space="preserve">lokális struktúráját </w:t>
+      </w:r>
+      <w:r>
+        <w:rPr>
+          <w:noProof/>
+        </w:rPr>
+        <w:t xml:space="preserve">hivatott </w:t>
+      </w:r>
+      <w:r>
+        <w:rPr>
+          <w:noProof/>
+        </w:rPr>
+        <w:t>hangsúlyozni.</w:t>
+      </w:r>
+      <w:r>
+        <w:rPr>
+          <w:noProof/>
+        </w:rPr>
+        <w:t xml:space="preserve"> Mindkét algoritmus bemenetére egy ResNet-50 konvolúciós neuronháló j</w:t>
+      </w:r>
+      <w:r>
+        <w:rPr>
+          <w:noProof/>
+        </w:rPr>
+        <w:t>ellemzőtérkép</w:t>
+      </w:r>
+      <w:r>
+        <w:rPr>
+          <w:noProof/>
+        </w:rPr>
+        <w:t>e került, ezáltal két fő jellemző alapján került klaszterezésre az adathalmaz 500 adata.</w:t>
+      </w:r>
+    </w:p>
+    <w:p>
+      <w:pPr>
+        <w:jc w:val="both"/>
+        <w:rPr>
+          <w:noProof/>
+        </w:rPr>
+      </w:pPr>
+      <w:r>
+        <w:t xml:space="preserve">Az általam választott adathalmaz rendelkezik maszkokkal minden képhez, ami az érintett területet jelöli, jelen esetben a tüdők pontos helyzetét, ami az a terület amit vizsgálva egy diagnózist lehet </w:t>
+      </w:r>
+      <w:r>
+        <w:lastRenderedPageBreak/>
+        <w:t>létrehozni a tüdőgyulladás eredetéről illetve okáról</w:t>
+      </w:r>
+      <w:r>
+        <w:rPr>
+          <w:noProof/>
+        </w:rPr>
+        <mc:AlternateContent>
+          <mc:Choice Requires="wpg">
+            <w:drawing>
+              <wp:anchor distT="0" distB="0" distL="114300" distR="114300" simplePos="0" relativeHeight="251658240" behindDoc="0" locked="0" layoutInCell="1" allowOverlap="1" wp14:anchorId="1C5469C1" wp14:editId="4277C553">
+                <wp:simplePos x="0" y="0"/>
+                <wp:positionH relativeFrom="margin">
+                  <wp:align>center</wp:align>
+                </wp:positionH>
+                <wp:positionV relativeFrom="paragraph">
+                  <wp:posOffset>750796</wp:posOffset>
+                </wp:positionV>
+                <wp:extent cx="4946650" cy="2020570"/>
+                <wp:effectExtent l="0" t="0" r="6350" b="0"/>
+                <wp:wrapTopAndBottom/>
+                <wp:docPr id="383366893" name="Csoportba foglalás 2"/>
+                <wp:cNvGraphicFramePr/>
+                <a:graphic xmlns:a="http://schemas.openxmlformats.org/drawingml/2006/main">
+                  <a:graphicData uri="http://schemas.microsoft.com/office/word/2010/wordprocessingGroup">
+                    <wpg:wgp>
+                      <wpg:cNvGrpSpPr/>
+                      <wpg:grpSpPr>
+                        <a:xfrm>
+                          <a:off x="0" y="0"/>
+                          <a:ext cx="4946650" cy="2020570"/>
+                          <a:chOff x="0" y="-211031"/>
+                          <a:chExt cx="4946720" cy="2021193"/>
+                        </a:xfrm>
+                      </wpg:grpSpPr>
+                      <pic:pic xmlns:pic="http://schemas.openxmlformats.org/drawingml/2006/picture">
+                        <pic:nvPicPr>
+                          <pic:cNvPr id="1893725312" name="Kép 1" descr="A képen képernyőkép, Színesség, szöveg, diagram látható&#10;&#10;Előfordulhat, hogy a mesterséges intelligencia által létrehozott tartalom helytelen."/>
+                          <pic:cNvPicPr>
+                            <a:picLocks noChangeAspect="1"/>
+                          </pic:cNvPicPr>
+                        </pic:nvPicPr>
+                        <pic:blipFill>
+                          <a:blip r:embed="rId6" cstate="print">
+                            <a:extLst>
+                              <a:ext uri="{28A0092B-C50C-407E-A947-70E740481C1C}">
+                                <a14:useLocalDpi xmlns:a14="http://schemas.microsoft.com/office/drawing/2010/main" val="0"/>
+                              </a:ext>
+                            </a:extLst>
+                          </a:blip>
+                          <a:stretch>
+                            <a:fillRect/>
+                          </a:stretch>
+                        </pic:blipFill>
+                        <pic:spPr>
+                          <a:xfrm>
+                            <a:off x="0" y="10572"/>
+                            <a:ext cx="2498725" cy="1799590"/>
+                          </a:xfrm>
+                          <a:prstGeom prst="rect">
+                            <a:avLst/>
+                          </a:prstGeom>
+                        </pic:spPr>
+                      </pic:pic>
+                      <pic:pic xmlns:pic="http://schemas.openxmlformats.org/drawingml/2006/picture">
+                        <pic:nvPicPr>
+                          <pic:cNvPr id="1185867669" name="Kép 1" descr="A képen képernyőkép látható&#10;&#10;Előfordulhat, hogy a mesterséges intelligencia által létrehozott tartalom helytelen."/>
+                          <pic:cNvPicPr>
+                            <a:picLocks noChangeAspect="1"/>
+                          </pic:cNvPicPr>
+                        </pic:nvPicPr>
+                        <pic:blipFill>
+                          <a:blip r:embed="rId7">
+                            <a:extLst>
+                              <a:ext uri="{28A0092B-C50C-407E-A947-70E740481C1C}">
+                                <a14:useLocalDpi xmlns:a14="http://schemas.microsoft.com/office/drawing/2010/main" val="0"/>
+                              </a:ext>
+                            </a:extLst>
+                          </a:blip>
+                          <a:stretch>
+                            <a:fillRect/>
+                          </a:stretch>
+                        </pic:blipFill>
+                        <pic:spPr>
+                          <a:xfrm>
+                            <a:off x="2500065" y="0"/>
+                            <a:ext cx="2446655" cy="1799590"/>
+                          </a:xfrm>
+                          <a:prstGeom prst="rect">
+                            <a:avLst/>
+                          </a:prstGeom>
+                        </pic:spPr>
+                      </pic:pic>
+                      <wps:wsp>
+                        <wps:cNvPr id="456343405" name="Szövegdoboz 2"/>
+                        <wps:cNvSpPr txBox="1">
+                          <a:spLocks noChangeArrowheads="1"/>
+                        </wps:cNvSpPr>
+                        <wps:spPr bwMode="auto">
+                          <a:xfrm>
+                            <a:off x="205072" y="-194734"/>
+                            <a:ext cx="2287270" cy="205740"/>
+                          </a:xfrm>
+                          <a:prstGeom prst="rect">
+                            <a:avLst/>
+                          </a:prstGeom>
+                          <a:solidFill>
+                            <a:srgbClr val="FFFFFF"/>
+                          </a:solidFill>
+                          <a:ln w="9525">
+                            <a:noFill/>
+                            <a:miter lim="800000"/>
+                            <a:headEnd/>
+                            <a:tailEnd/>
+                          </a:ln>
+                        </wps:spPr>
+                        <wps:txbx>
+                          <w:txbxContent>
+                            <w:p>
+                              <w:pPr>
+                                <w:jc w:val="center"/>
+                                <w:rPr>
+                                  <w:sz w:val="14"/>
+                                  <w:szCs w:val="14"/>
+                                </w:rPr>
+                              </w:pPr>
+                              <w:r>
+                                <w:rPr>
+                                  <w:sz w:val="14"/>
+                                  <w:szCs w:val="14"/>
+                                </w:rPr>
+                                <w:t>Jellemző</w:t>
+                              </w:r>
+                              <w:r>
+                                <w:rPr>
+                                  <w:sz w:val="14"/>
+                                  <w:szCs w:val="14"/>
+                                </w:rPr>
+                                <w:t>térkép alapú PCA klaszterezés</w:t>
+                              </w:r>
+                            </w:p>
+                          </w:txbxContent>
+                        </wps:txbx>
+                        <wps:bodyPr rot="0" vert="horz" wrap="square" lIns="91440" tIns="45720" rIns="91440" bIns="45720" anchor="t" anchorCtr="0">
+                          <a:noAutofit/>
+                        </wps:bodyPr>
+                      </wps:wsp>
+                      <wps:wsp>
+                        <wps:cNvPr id="1654318160" name="Szövegdoboz 2"/>
+                        <wps:cNvSpPr txBox="1">
+                          <a:spLocks noChangeArrowheads="1"/>
+                        </wps:cNvSpPr>
+                        <wps:spPr bwMode="auto">
+                          <a:xfrm>
+                            <a:off x="2658632" y="-211031"/>
+                            <a:ext cx="2266950" cy="221615"/>
+                          </a:xfrm>
+                          <a:prstGeom prst="rect">
+                            <a:avLst/>
+                          </a:prstGeom>
+                          <a:solidFill>
+                            <a:srgbClr val="FFFFFF"/>
+                          </a:solidFill>
+                          <a:ln w="9525">
+                            <a:noFill/>
+                            <a:miter lim="800000"/>
+                            <a:headEnd/>
+                            <a:tailEnd/>
+                          </a:ln>
+                        </wps:spPr>
+                        <wps:txbx>
+                          <w:txbxContent>
+                            <w:p>
+                              <w:pPr>
+                                <w:jc w:val="center"/>
+                                <w:rPr>
+                                  <w:sz w:val="14"/>
+                                  <w:szCs w:val="14"/>
+                                </w:rPr>
+                              </w:pPr>
+                              <w:r>
+                                <w:rPr>
+                                  <w:sz w:val="14"/>
+                                  <w:szCs w:val="14"/>
+                                </w:rPr>
+                                <w:t>Jellemző</w:t>
+                              </w:r>
+                              <w:r>
+                                <w:rPr>
+                                  <w:sz w:val="14"/>
+                                  <w:szCs w:val="14"/>
+                                </w:rPr>
+                                <w:t xml:space="preserve">térkép </w:t>
+                              </w:r>
+                              <w:r>
+                                <w:rPr>
+                                  <w:sz w:val="14"/>
+                                  <w:szCs w:val="14"/>
+                                </w:rPr>
+                                <w:t xml:space="preserve">alapú </w:t>
+                              </w:r>
+                              <w:r>
+                                <w:rPr>
+                                  <w:sz w:val="14"/>
+                                  <w:szCs w:val="14"/>
+                                </w:rPr>
+                                <w:t>T-SNE</w:t>
+                              </w:r>
+                              <w:r>
+                                <w:rPr>
+                                  <w:sz w:val="14"/>
+                                  <w:szCs w:val="14"/>
+                                </w:rPr>
+                                <w:t xml:space="preserve"> klaszterezés</w:t>
+                              </w:r>
+                            </w:p>
+                          </w:txbxContent>
+                        </wps:txbx>
+                        <wps:bodyPr rot="0" vert="horz" wrap="square" lIns="91440" tIns="45720" rIns="91440" bIns="45720" anchor="t" anchorCtr="0">
+                          <a:noAutofit/>
+                        </wps:bodyPr>
+                      </wps:wsp>
+                    </wpg:wgp>
+                  </a:graphicData>
+                </a:graphic>
+                <wp14:sizeRelV relativeFrom="margin">
+                  <wp14:pctHeight>0</wp14:pctHeight>
+                </wp14:sizeRelV>
+              </wp:anchor>
+            </w:drawing>
+          </mc:Choice>
+          <mc:Fallback>
+            <w:pict>
+              <v:group w14:anchorId="1C5469C1" id="Csoportba foglalás 2" o:spid="_x0000_s1026" style="position:absolute;left:0;text-align:left;margin-left:0;margin-top:59.1pt;width:389.5pt;height:159.1pt;z-index:251658240;mso-position-horizontal:center;mso-position-horizontal-relative:margin;mso-height-relative:margin" coordorigin=",-2110" coordsize="49467,20211" o:gfxdata="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">
+                <v:shapetype id="_x0000_t75" coordsize="21600,21600" o:spt="75" o:preferrelative="t" path="m@4@5l@4@11@9@11@9@5xe" filled="f" stroked="f">
+                  <v:stroke joinstyle="miter"/>
+                  <v:formulas>
+                    <v:f eqn="if lineDrawn pixelLineWidth 0"/>
+                    <v:f eqn="sum @0 1 0"/>
+                    <v:f eqn="sum 0 0 @1"/>
+                    <v:f eqn="prod @2 1 2"/>
+                    <v:f eqn="prod @3 21600 pixelWidth"/>
+                    <v:f eqn="prod @3 21600 pixelHeight"/>
+                    <v:f eqn="sum @0 0 1"/>
+                    <v:f eqn="prod @6 1 2"/>
+                    <v:f eqn="prod @7 21600 pixelWidth"/>
+                    <v:f eqn="sum @8 21600 0"/>
+                    <v:f eqn="prod @7 21600 pixelHeight"/>
+                    <v:f eqn="sum @10 21600 0"/>
+                  </v:formulas>
+                  <v:path o:extrusionok="f" gradientshapeok="t" o:connecttype="rect"/>
+                  <o:lock v:ext="edit" aspectratio="t"/>
+                </v:shapetype>
+                <v:shape id="Kép 1" o:spid="_x0000_s1027" type="#_x0000_t75" alt="A képen képernyőkép, Színesség, szöveg, diagram látható&#10;&#10;Előfordulhat, hogy a mesterséges intelligencia által létrehozott tartalom helytelen." style="position:absolute;top:105;width:24987;height:17996;visibility:visible;mso-wrap-style:square" o:gfxdata="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">
+                  <v:imagedata r:id="rId8" o:title="A képen képernyőkép, Színesség, szöveg, diagram látható&#10;&#10;Előfordulhat, hogy a mesterséges intelligencia által létrehozott tartalom helytelen"/>
+                </v:shape>
+                <v:shape id="Kép 1" o:spid="_x0000_s1028" type="#_x0000_t75" alt="A képen képernyőkép látható&#10;&#10;Előfordulhat, hogy a mesterséges intelligencia által létrehozott tartalom helytelen." style="position:absolute;left:25000;width:24467;height:17995;visibility:visible;mso-wrap-style:square" o:gfxdata="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">
+                  <v:imagedata r:id="rId9" o:title="A képen képernyőkép látható&#10;&#10;Előfordulhat, hogy a mesterséges intelligencia által létrehozott tartalom helytelen"/>
+                </v:shape>
+                <v:shapetype id="_x0000_t202" coordsize="21600,21600" o:spt="202" path="m,l,21600r21600,l21600,xe">
+                  <v:stroke joinstyle="miter"/>
+                  <v:path gradientshapeok="t" o:connecttype="rect"/>
+                </v:shapetype>
+                <v:shape id="Szövegdoboz 2" o:spid="_x0000_s1029" type="#_x0000_t202" style="position:absolute;left:2050;top:-1947;width:22873;height:2057;visibility:visible;mso-wrap-style:square;v-text-anchor:top" o:gfxdata="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" stroked="f">
+                  <v:textbox>
+                    <w:txbxContent>
+                      <w:p>
+                        <w:pPr>
+                          <w:jc w:val="center"/>
+                          <w:rPr>
+                            <w:sz w:val="14"/>
+                            <w:szCs w:val="14"/>
+                          </w:rPr>
+                        </w:pPr>
+                        <w:r>
+                          <w:rPr>
+                            <w:sz w:val="14"/>
+                            <w:szCs w:val="14"/>
+                          </w:rPr>
+                          <w:t>Jellemző</w:t>
+                        </w:r>
+                        <w:r>
+                          <w:rPr>
+                            <w:sz w:val="14"/>
+                            <w:szCs w:val="14"/>
+                          </w:rPr>
+                          <w:t>térkép alapú PCA klaszterezés</w:t>
+                        </w:r>
+                      </w:p>
+                    </w:txbxContent>
+                  </v:textbox>
+                </v:shape>
+                <v:shape id="Szövegdoboz 2" o:spid="_x0000_s1030" type="#_x0000_t202" style="position:absolute;left:26586;top:-2110;width:22669;height:2215;visibility:visible;mso-wrap-style:square;v-text-anchor:top" o:gfxdata="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" stroked="f">
+                  <v:textbox>
+                    <w:txbxContent>
+                      <w:p>
+                        <w:pPr>
+                          <w:jc w:val="center"/>
+                          <w:rPr>
+                            <w:sz w:val="14"/>
+                            <w:szCs w:val="14"/>
+                          </w:rPr>
+                        </w:pPr>
+                        <w:r>
+                          <w:rPr>
+                            <w:sz w:val="14"/>
+                            <w:szCs w:val="14"/>
+                          </w:rPr>
+                          <w:t>Jellemző</w:t>
+                        </w:r>
+                        <w:r>
+                          <w:rPr>
+                            <w:sz w:val="14"/>
+                            <w:szCs w:val="14"/>
+                          </w:rPr>
+                          <w:t xml:space="preserve">térkép </w:t>
+                        </w:r>
+                        <w:r>
+                          <w:rPr>
+                            <w:sz w:val="14"/>
+                            <w:szCs w:val="14"/>
+                          </w:rPr>
+                          <w:t xml:space="preserve">alapú </w:t>
+                        </w:r>
+                        <w:r>
+                          <w:rPr>
+                            <w:sz w:val="14"/>
+                            <w:szCs w:val="14"/>
+                          </w:rPr>
+                          <w:t>T-SNE</w:t>
+                        </w:r>
+                        <w:r>
+                          <w:rPr>
+                            <w:sz w:val="14"/>
+                            <w:szCs w:val="14"/>
+                          </w:rPr>
+                          <w:t xml:space="preserve"> klaszterezés</w:t>
+                        </w:r>
+                      </w:p>
+                    </w:txbxContent>
+                  </v:textbox>
+                </v:shape>
+                <w10:wrap type="topAndBottom" anchorx="margin"/>
+              </v:group>
+            </w:pict>
+          </mc:Fallback>
+        </mc:AlternateContent>
+      </w:r>
+      <w:r>
+        <w:t xml:space="preserve">. </w:t>
+      </w:r>
+      <w:r>
+        <w:t>El</w:t>
+      </w:r>
+      <w:r>
+        <w:rPr>
+          <w:lang w:val="en-US"/>
+        </w:rPr>
+        <w:t>őször az</w:t>
+      </w:r>
+      <w:r>
+        <w:rPr>
+          <w:lang w:val="en-US"/>
+        </w:rPr>
+        <w:t xml:space="preserve"> klaszterez</w:t>
+      </w:r>
+      <w:r>
+        <w:t>éses</w:t>
+      </w:r>
+      <w:r>
+        <w:rPr>
+          <w:lang w:val="en-US"/>
+        </w:rPr>
+        <w:t xml:space="preserve"> elemzést nem maszkolt képeken végeztem</w:t>
+      </w:r>
+      <w:r>
+        <w:rPr>
+          <w:noProof/>
+        </w:rPr>
+        <w:t>.</w:t>
+      </w:r>
+      <w:r>
+        <w:rPr>
+          <w:noProof/>
+        </w:rPr>
+        <w:t xml:space="preserve"> </w:t>
+      </w:r>
+      <w:r>
+        <w:rPr>
+          <w:noProof/>
+        </w:rPr>
+        <w:t>A</w:t>
+      </w:r>
+      <w:r>
+        <w:rPr>
+          <w:noProof/>
+        </w:rPr>
+        <w:t xml:space="preserve">hogy az alábbi ábrán látható, az osztályok </w:t>
+      </w:r>
+      <w:r>
+        <w:rPr>
+          <w:noProof/>
+        </w:rPr>
+        <w:t xml:space="preserve">rendelkznek helyenként átfedésekkel, de </w:t>
+      </w:r>
+      <w:r>
+        <w:rPr>
+          <w:noProof/>
+        </w:rPr>
+        <w:t>viszonylag jól elkülőníthetők egymástól</w:t>
+      </w:r>
+      <w:r>
+        <w:rPr>
+          <w:noProof/>
+        </w:rPr>
+        <w:t>. Ennek következtében</w:t>
+      </w:r>
+      <w:r>
+        <w:rPr>
+          <w:noProof/>
+        </w:rPr>
+        <w:t xml:space="preserve"> feltételezhető hogy megtanítható</w:t>
+      </w:r>
+      <w:r>
+        <w:rPr>
+          <w:noProof/>
+        </w:rPr>
+        <w:t xml:space="preserve"> ez az osztályozási feladat</w:t>
+      </w:r>
+      <w:r>
+        <w:rPr>
+          <w:noProof/>
+        </w:rPr>
+        <w:t xml:space="preserve"> egy mélytanulású neuronhálónak</w:t>
+      </w:r>
+      <w:r>
+        <w:rPr>
+          <w:noProof/>
+        </w:rPr>
+        <w:t>.</w:t>
+      </w:r>
+    </w:p>
+    <w:p>
+      <w:pPr>
+        <w:ind w:firstLine="360"/>
+        <w:jc w:val="both"/>
+        <w:rPr>
+          <w:noProof/>
+        </w:rPr>
+      </w:pPr>
+      <w:r>
+        <w:rPr>
+          <w:noProof/>
+        </w:rPr>
+        <w:t xml:space="preserve">Annak érdekében, hogy tudjam zajmentesíteni a bemeneti adatokat, alkalmaztam az adathalmazhoz tartozó bináris (fekete alapon fehér) maszkokat az eredeti képekre futásidőben, és megismételtem a fennebb említett folyamatot. Lennebb látható egy példa a maszkolt képekre és az így kapott </w:t>
+      </w:r>
+      <w:r>
+        <w:rPr>
+          <w:noProof/>
+        </w:rPr>
+        <w:t>klaszterezési eredményre</w:t>
+      </w:r>
+      <w:r>
+        <w:rPr>
+          <w:noProof/>
+        </w:rPr>
+        <w:t>.</w:t>
+      </w:r>
+    </w:p>
+    <w:p>
+      <w:pPr>
+        <w:spacing w:before="240"/>
+        <w:jc w:val="both"/>
+        <w:rPr>
+          <w:lang w:val="en-US"/>
+        </w:rPr>
+      </w:pPr>
+      <w:r>
+        <w:rPr>
+          <w:noProof/>
+          <w:lang w:val="en-US"/>
+        </w:rPr>
+        <mc:AlternateContent>
+          <mc:Choice Requires="wpg">
+            <w:drawing>
+              <wp:anchor distT="0" distB="0" distL="114300" distR="114300" simplePos="0" relativeHeight="251672576" behindDoc="0" locked="0" layoutInCell="1" allowOverlap="1" wp14:anchorId="3A2F4AAC" wp14:editId="6D1ECE7D">
+                <wp:simplePos x="0" y="0"/>
+                <wp:positionH relativeFrom="margin">
+                  <wp:align>center</wp:align>
+                </wp:positionH>
+                <wp:positionV relativeFrom="paragraph">
+                  <wp:posOffset>967913</wp:posOffset>
+                </wp:positionV>
+                <wp:extent cx="5026660" cy="3261938"/>
+                <wp:effectExtent l="0" t="0" r="2540" b="0"/>
+                <wp:wrapTopAndBottom/>
+                <wp:docPr id="52713406" name="Csoportba foglalás 6"/>
+                <wp:cNvGraphicFramePr/>
+                <a:graphic xmlns:a="http://schemas.openxmlformats.org/drawingml/2006/main">
+                  <a:graphicData uri="http://schemas.microsoft.com/office/word/2010/wordprocessingGroup">
+                    <wpg:wgp>
+                      <wpg:cNvGrpSpPr/>
+                      <wpg:grpSpPr>
+                        <a:xfrm>
+                          <a:off x="0" y="0"/>
+                          <a:ext cx="5026660" cy="3261938"/>
+                          <a:chOff x="0" y="0"/>
+                          <a:chExt cx="5026660" cy="3261938"/>
+                        </a:xfrm>
+                      </wpg:grpSpPr>
+                      <wpg:grpSp>
+                        <wpg:cNvPr id="600559772" name="Csoportba foglalás 4"/>
+                        <wpg:cNvGrpSpPr/>
+                        <wpg:grpSpPr>
+                          <a:xfrm>
+                            <a:off x="1018309" y="2140528"/>
+                            <a:ext cx="3235960" cy="1121410"/>
+                            <a:chOff x="0" y="0"/>
+                            <a:chExt cx="3235960" cy="1121410"/>
+                          </a:xfrm>
+                        </wpg:grpSpPr>
+                        <pic:pic xmlns:pic="http://schemas.openxmlformats.org/drawingml/2006/picture">
+                          <pic:nvPicPr>
+                            <pic:cNvPr id="1787549483" name="Kép 3"/>
+                            <pic:cNvPicPr>
+                              <a:picLocks noChangeAspect="1"/>
+                            </pic:cNvPicPr>
+                          </pic:nvPicPr>
+                          <pic:blipFill rotWithShape="1">
+                            <a:blip r:embed="rId10">
+                              <a:extLst>
+                                <a:ext uri="{28A0092B-C50C-407E-A947-70E740481C1C}">
+                                  <a14:useLocalDpi xmlns:a14="http://schemas.microsoft.com/office/drawing/2010/main" val="0"/>
+                                </a:ext>
+                              </a:extLst>
+                            </a:blip>
+                            <a:srcRect l="20364" r="60190"/>
+                            <a:stretch/>
+                          </pic:blipFill>
+                          <pic:spPr bwMode="auto">
+                            <a:xfrm>
+                              <a:off x="0" y="0"/>
+                              <a:ext cx="1065530" cy="1121410"/>
+                            </a:xfrm>
+                            <a:prstGeom prst="rect">
+                              <a:avLst/>
+                            </a:prstGeom>
+                            <a:noFill/>
+                            <a:ln>
+                              <a:noFill/>
+                            </a:ln>
+                            <a:extLst>
+                              <a:ext uri="{53640926-AAD7-44D8-BBD7-CCE9431645EC}">
+                                <a14:shadowObscured xmlns:a14="http://schemas.microsoft.com/office/drawing/2010/main"/>
+                              </a:ext>
+                            </a:extLst>
+                          </pic:spPr>
+                        </pic:pic>
+                        <pic:pic xmlns:pic="http://schemas.openxmlformats.org/drawingml/2006/picture">
+                          <pic:nvPicPr>
+                            <pic:cNvPr id="845882294" name="Kép 3" descr="A képen röntgenfilm, képernyőkép, fekete, fekete-fehér látható&#10;&#10;Előfordulhat, hogy a mesterséges intelligencia által létrehozott tartalom helytelen."/>
+                            <pic:cNvPicPr>
+                              <a:picLocks noChangeAspect="1"/>
+                            </pic:cNvPicPr>
+                          </pic:nvPicPr>
+                          <pic:blipFill rotWithShape="1">
+                            <a:blip r:embed="rId10">
+                              <a:extLst>
+                                <a:ext uri="{28A0092B-C50C-407E-A947-70E740481C1C}">
+                                  <a14:useLocalDpi xmlns:a14="http://schemas.microsoft.com/office/drawing/2010/main" val="0"/>
+                                </a:ext>
+                              </a:extLst>
+                            </a:blip>
+                            <a:srcRect l="60792" r="93"/>
+                            <a:stretch/>
+                          </pic:blipFill>
+                          <pic:spPr bwMode="auto">
+                            <a:xfrm>
+                              <a:off x="1093470" y="0"/>
+                              <a:ext cx="2142490" cy="1121410"/>
+                            </a:xfrm>
+                            <a:prstGeom prst="rect">
+                              <a:avLst/>
+                            </a:prstGeom>
+                            <a:noFill/>
+                            <a:ln>
+                              <a:noFill/>
+                            </a:ln>
+                            <a:extLst>
+                              <a:ext uri="{53640926-AAD7-44D8-BBD7-CCE9431645EC}">
+                                <a14:shadowObscured xmlns:a14="http://schemas.microsoft.com/office/drawing/2010/main"/>
+                              </a:ext>
+                            </a:extLst>
+                          </pic:spPr>
+                        </pic:pic>
+                      </wpg:grpSp>
+                      <wpg:grpSp>
+                        <wpg:cNvPr id="8315033" name="Csoportba foglalás 9"/>
+                        <wpg:cNvGrpSpPr/>
+                        <wpg:grpSpPr>
+                          <a:xfrm>
+                            <a:off x="0" y="0"/>
+                            <a:ext cx="5026660" cy="2004059"/>
+                            <a:chOff x="0" y="0"/>
+                            <a:chExt cx="5026977" cy="2004377"/>
+                          </a:xfrm>
+                        </wpg:grpSpPr>
+                        <wpg:grpSp>
+                          <wpg:cNvPr id="42168358" name="Csoportba foglalás 7"/>
+                          <wpg:cNvGrpSpPr/>
+                          <wpg:grpSpPr>
+                            <a:xfrm>
+                              <a:off x="2576512" y="0"/>
+                              <a:ext cx="2450465" cy="2004377"/>
+                              <a:chOff x="0" y="0"/>
+                              <a:chExt cx="2450465" cy="2004377"/>
+                            </a:xfrm>
+                          </wpg:grpSpPr>
+                          <wps:wsp>
+                            <wps:cNvPr id="161960847" name="Szövegdoboz 2"/>
+                            <wps:cNvSpPr txBox="1">
+                              <a:spLocks noChangeArrowheads="1"/>
+                            </wps:cNvSpPr>
+                            <wps:spPr bwMode="auto">
+                              <a:xfrm>
+                                <a:off x="180975" y="0"/>
+                                <a:ext cx="2232707" cy="213173"/>
+                              </a:xfrm>
+                              <a:prstGeom prst="rect">
+                                <a:avLst/>
+                              </a:prstGeom>
+                              <a:solidFill>
+                                <a:srgbClr val="FFFFFF"/>
+                              </a:solidFill>
+                              <a:ln w="9525">
+                                <a:noFill/>
+                                <a:miter lim="800000"/>
+                                <a:headEnd/>
+                                <a:tailEnd/>
+                              </a:ln>
+                            </wps:spPr>
+                            <wps:txbx>
+                              <w:txbxContent>
+                                <w:p>
+                                  <w:pPr>
+                                    <w:jc w:val="center"/>
+                                    <w:rPr>
+                                      <w:sz w:val="14"/>
+                                      <w:szCs w:val="14"/>
+                                    </w:rPr>
+                                  </w:pPr>
+                                  <w:r>
+                                    <w:rPr>
+                                      <w:sz w:val="14"/>
+                                      <w:szCs w:val="14"/>
+                                    </w:rPr>
+                                    <w:t>Jellemző</w:t>
+                                  </w:r>
+                                  <w:r>
+                                    <w:rPr>
+                                      <w:sz w:val="14"/>
+                                      <w:szCs w:val="14"/>
+                                    </w:rPr>
+                                    <w:t xml:space="preserve">térkép </w:t>
+                                  </w:r>
+                                  <w:r>
+                                    <w:rPr>
+                                      <w:sz w:val="14"/>
+                                      <w:szCs w:val="14"/>
+                                    </w:rPr>
+                                    <w:t xml:space="preserve">alapú </w:t>
+                                  </w:r>
+                                  <w:r>
+                                    <w:rPr>
+                                      <w:sz w:val="14"/>
+                                      <w:szCs w:val="14"/>
+                                    </w:rPr>
+                                    <w:t>T-SNE</w:t>
+                                  </w:r>
+                                  <w:r>
+                                    <w:rPr>
+                                      <w:sz w:val="14"/>
+                                      <w:szCs w:val="14"/>
+                                    </w:rPr>
+                                    <w:t xml:space="preserve"> klaszterezés</w:t>
+                                  </w:r>
+                                </w:p>
+                              </w:txbxContent>
+                            </wps:txbx>
+                            <wps:bodyPr rot="0" vert="horz" wrap="square" lIns="91440" tIns="45720" rIns="91440" bIns="45720" anchor="t" anchorCtr="0">
+                              <a:noAutofit/>
+                            </wps:bodyPr>
+                          </wps:wsp>
+                          <pic:pic xmlns:pic="http://schemas.openxmlformats.org/drawingml/2006/picture">
+                            <pic:nvPicPr>
+                              <pic:cNvPr id="408695307" name="Kép 6" descr="A képen képernyőkép, szöveg, Színesség látható&#10;&#10;Előfordulhat, hogy a mesterséges intelligencia által létrehozott tartalom helytelen."/>
+                              <pic:cNvPicPr>
+                                <a:picLocks noChangeAspect="1"/>
+                              </pic:cNvPicPr>
+                            </pic:nvPicPr>
+                            <pic:blipFill rotWithShape="1">
+                              <a:blip r:embed="rId11" cstate="print">
+                                <a:extLst>
+                                  <a:ext uri="{28A0092B-C50C-407E-A947-70E740481C1C}">
+                                    <a14:useLocalDpi xmlns:a14="http://schemas.microsoft.com/office/drawing/2010/main" val="0"/>
+                                  </a:ext>
+                                </a:extLst>
+                              </a:blip>
+                              <a:srcRect t="5657"/>
+                              <a:stretch/>
+                            </pic:blipFill>
+                            <pic:spPr bwMode="auto">
+                              <a:xfrm>
+                                <a:off x="0" y="204787"/>
+                                <a:ext cx="2450465" cy="1799590"/>
+                              </a:xfrm>
+                              <a:prstGeom prst="rect">
+                                <a:avLst/>
+                              </a:prstGeom>
+                              <a:noFill/>
+                              <a:ln>
+                                <a:noFill/>
+                              </a:ln>
+                              <a:extLst>
+                                <a:ext uri="{53640926-AAD7-44D8-BBD7-CCE9431645EC}">
+                                  <a14:shadowObscured xmlns:a14="http://schemas.microsoft.com/office/drawing/2010/main"/>
+                                </a:ext>
+                              </a:extLst>
+                            </pic:spPr>
+                          </pic:pic>
+                        </wpg:grpSp>
+                        <wpg:grpSp>
+                          <wpg:cNvPr id="218082153" name="Csoportba foglalás 8"/>
+                          <wpg:cNvGrpSpPr/>
+                          <wpg:grpSpPr>
+                            <a:xfrm>
+                              <a:off x="0" y="4763"/>
+                              <a:ext cx="2582545" cy="1999614"/>
+                              <a:chOff x="0" y="0"/>
+                              <a:chExt cx="2582545" cy="1999614"/>
+                            </a:xfrm>
+                          </wpg:grpSpPr>
+                          <wps:wsp>
+                            <wps:cNvPr id="576046989" name="Szövegdoboz 2"/>
+                            <wps:cNvSpPr txBox="1">
+                              <a:spLocks noChangeArrowheads="1"/>
+                            </wps:cNvSpPr>
+                            <wps:spPr bwMode="auto">
+                              <a:xfrm>
+                                <a:off x="133350" y="0"/>
+                                <a:ext cx="2412221" cy="205717"/>
+                              </a:xfrm>
+                              <a:prstGeom prst="rect">
+                                <a:avLst/>
+                              </a:prstGeom>
+                              <a:solidFill>
+                                <a:srgbClr val="FFFFFF"/>
+                              </a:solidFill>
+                              <a:ln w="9525">
+                                <a:noFill/>
+                                <a:miter lim="800000"/>
+                                <a:headEnd/>
+                                <a:tailEnd/>
+                              </a:ln>
+                            </wps:spPr>
+                            <wps:txbx>
+                              <w:txbxContent>
+                                <w:p>
+                                  <w:pPr>
+                                    <w:jc w:val="center"/>
+                                    <w:rPr>
+                                      <w:sz w:val="14"/>
+                                      <w:szCs w:val="14"/>
+                                    </w:rPr>
+                                  </w:pPr>
+                                  <w:r>
+                                    <w:rPr>
+                                      <w:sz w:val="14"/>
+                                      <w:szCs w:val="14"/>
+                                    </w:rPr>
+                                    <w:t>Jellemző</w:t>
+                                  </w:r>
+                                  <w:r>
+                                    <w:rPr>
+                                      <w:sz w:val="14"/>
+                                      <w:szCs w:val="14"/>
+                                    </w:rPr>
+                                    <w:t xml:space="preserve">térkép </w:t>
+                                  </w:r>
+                                  <w:r>
+                                    <w:rPr>
+                                      <w:sz w:val="14"/>
+                                      <w:szCs w:val="14"/>
+                                    </w:rPr>
+                                    <w:t>alapú PCA klaszterezés</w:t>
+                                  </w:r>
+                                </w:p>
+                              </w:txbxContent>
+                            </wps:txbx>
+                            <wps:bodyPr rot="0" vert="horz" wrap="square" lIns="91440" tIns="45720" rIns="91440" bIns="45720" anchor="t" anchorCtr="0">
+                              <a:noAutofit/>
+                            </wps:bodyPr>
+                          </wps:wsp>
+                          <pic:pic xmlns:pic="http://schemas.openxmlformats.org/drawingml/2006/picture">
+                            <pic:nvPicPr>
+                              <pic:cNvPr id="2095701816" name="Kép 5" descr="A képen képernyőkép, szöveg, Színesség, diagram látható&#10;&#10;Előfordulhat, hogy a mesterséges intelligencia által létrehozott tartalom helytelen."/>
+                              <pic:cNvPicPr>
+                                <a:picLocks noChangeAspect="1"/>
+                              </pic:cNvPicPr>
+                            </pic:nvPicPr>
+                            <pic:blipFill rotWithShape="1">
+                              <a:blip r:embed="rId12">
+                                <a:extLst>
+                                  <a:ext uri="{28A0092B-C50C-407E-A947-70E740481C1C}">
+                                    <a14:useLocalDpi xmlns:a14="http://schemas.microsoft.com/office/drawing/2010/main" val="0"/>
+                                  </a:ext>
+                                </a:extLst>
+                              </a:blip>
+                              <a:srcRect t="4941"/>
+                              <a:stretch/>
+                            </pic:blipFill>
+                            <pic:spPr bwMode="auto">
+                              <a:xfrm>
+                                <a:off x="0" y="200024"/>
+                                <a:ext cx="2582545" cy="1799590"/>
+                              </a:xfrm>
+                              <a:prstGeom prst="rect">
+                                <a:avLst/>
+                              </a:prstGeom>
+                              <a:noFill/>
+                              <a:ln>
+                                <a:noFill/>
+                              </a:ln>
+                              <a:extLst>
+                                <a:ext uri="{53640926-AAD7-44D8-BBD7-CCE9431645EC}">
+                                  <a14:shadowObscured xmlns:a14="http://schemas.microsoft.com/office/drawing/2010/main"/>
+                                </a:ext>
+                              </a:extLst>
+                            </pic:spPr>
+                          </pic:pic>
+                        </wpg:grpSp>
+                      </wpg:grpSp>
+                    </wpg:wgp>
+                  </a:graphicData>
+                </a:graphic>
+                <wp14:sizeRelH relativeFrom="margin">
+                  <wp14:pctWidth>0</wp14:pctWidth>
+                </wp14:sizeRelH>
+                <wp14:sizeRelV relativeFrom="margin">
+                  <wp14:pctHeight>0</wp14:pctHeight>
+                </wp14:sizeRelV>
+              </wp:anchor>
+            </w:drawing>
+          </mc:Choice>
+          <mc:Fallback>
+            <w:pict>
+              <v:group w14:anchorId="3A2F4AAC" id="Csoportba foglalás 6" o:spid="_x0000_s1031" style="position:absolute;left:0;text-align:left;margin-left:0;margin-top:76.2pt;width:395.8pt;height:256.85pt;z-index:251672576;mso-position-horizontal:center;mso-position-horizontal-relative:margin;mso-width-relative:margin;mso-height-relative:margin" coordsize="50266,32619" o:gfxdata="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